<commit_message>
Enhance OneAI Comparison and Localization Updates
- Added HTML rendering for titles and descriptions in the OneAI comparison section to improve formatting and presentation.
- Updated test cases to validate the new expectations for the comparison rows.
- Enhanced localization files for both English and Indonesian, incorporating the term "allowance" in italics for consistency and clarity.
- Modified the leadership memo generation script to reflect the latest changes in messaging and descriptions.

These updates aim to improve user engagement and understanding of OneAI's features through better formatting and localized content.
</commit_message>
<xml_diff>
--- a/public/documents/oneai-leadership-memo-id.docx
+++ b/public/documents/oneai-leadership-memo-id.docx
@@ -568,7 +568,27 @@
           <w:color w:val="425466"/>
           <w:sz w:val="22"/>
         </w:rPr>
-        <w:t>Tim sudah memakai AI. Langganan pribadi, tunjangan informal, atau beli kredit secara ad hoc tidak memberi kita:</w:t>
+        <w:t xml:space="preserve">Tim sudah memakai AI. Langganan pribadi, </w:t>
+      </w:r>
+      <w:r>
+        <w:rPr>
+          <w:rFonts w:ascii="Calibri" w:hAnsi="Calibri" w:eastAsia="Calibri"/>
+          <w:b w:val="0"/>
+          <w:i/>
+          <w:color w:val="425466"/>
+          <w:sz w:val="22"/>
+        </w:rPr>
+        <w:t>allowance</w:t>
+      </w:r>
+      <w:r>
+        <w:rPr>
+          <w:rFonts w:ascii="Calibri" w:hAnsi="Calibri" w:eastAsia="Calibri"/>
+          <w:b w:val="0"/>
+          <w:i w:val="0"/>
+          <w:color w:val="425466"/>
+          <w:sz w:val="22"/>
+        </w:rPr>
+        <w:t xml:space="preserve"> informal, atau beli kredit secara ad hoc tidak memberi kita:</w:t>
       </w:r>
     </w:p>
     <w:p>
@@ -620,7 +640,27 @@
           <w:color w:val="425466"/>
           <w:sz w:val="22"/>
         </w:rPr>
-        <w:t>satu tagihan, bukan 20-40 langganan dan tunjangan yang tidak terverifikasi.</w:t>
+        <w:t xml:space="preserve">satu tagihan, bukan 20-40 langganan dan </w:t>
+      </w:r>
+      <w:r>
+        <w:rPr>
+          <w:rFonts w:ascii="Calibri" w:hAnsi="Calibri" w:eastAsia="Calibri"/>
+          <w:b w:val="0"/>
+          <w:i/>
+          <w:color w:val="425466"/>
+          <w:sz w:val="22"/>
+        </w:rPr>
+        <w:t>allowance</w:t>
+      </w:r>
+      <w:r>
+        <w:rPr>
+          <w:rFonts w:ascii="Calibri" w:hAnsi="Calibri" w:eastAsia="Calibri"/>
+          <w:b w:val="0"/>
+          <w:i w:val="0"/>
+          <w:color w:val="425466"/>
+          <w:sz w:val="22"/>
+        </w:rPr>
+        <w:t xml:space="preserve"> yang tidak terverifikasi.</w:t>
       </w:r>
     </w:p>
     <w:p>
@@ -688,7 +728,27 @@
           <w:color w:val="425466"/>
           <w:sz w:val="22"/>
         </w:rPr>
-        <w:t>Uang yang diberikan sebagai tunjangan bisa dipakai untuk apa saja. Kita membayar kapasitas yang tidak bisa kita lihat, dan tidak bisa menegakkan kebijakan perusahaan.</w:t>
+        <w:t xml:space="preserve">Uang yang diberikan sebagai </w:t>
+      </w:r>
+      <w:r>
+        <w:rPr>
+          <w:rFonts w:ascii="Calibri" w:hAnsi="Calibri" w:eastAsia="Calibri"/>
+          <w:b w:val="0"/>
+          <w:i/>
+          <w:color w:val="425466"/>
+          <w:sz w:val="22"/>
+        </w:rPr>
+        <w:t>allowance</w:t>
+      </w:r>
+      <w:r>
+        <w:rPr>
+          <w:rFonts w:ascii="Calibri" w:hAnsi="Calibri" w:eastAsia="Calibri"/>
+          <w:b w:val="0"/>
+          <w:i w:val="0"/>
+          <w:color w:val="425466"/>
+          <w:sz w:val="22"/>
+        </w:rPr>
+        <w:t xml:space="preserve"> bisa dipakai untuk apa saja. Kita membayar kapasitas yang tidak bisa kita lihat, dan tidak bisa menegakkan kebijakan perusahaan.</w:t>
       </w:r>
     </w:p>
     <w:p>
@@ -985,11 +1045,21 @@
               <w:rPr>
                 <w:rFonts w:ascii="Calibri" w:hAnsi="Calibri" w:eastAsia="Calibri"/>
                 <w:b/>
+                <w:i/>
+                <w:color w:val="FFFFFF"/>
+                <w:sz w:val="18"/>
+              </w:rPr>
+              <w:t>Allowance</w:t>
+            </w:r>
+            <w:r>
+              <w:rPr>
+                <w:rFonts w:ascii="Calibri" w:hAnsi="Calibri" w:eastAsia="Calibri"/>
+                <w:b/>
                 <w:i w:val="0"/>
                 <w:color w:val="FFFFFF"/>
                 <w:sz w:val="18"/>
               </w:rPr>
-              <w:t>Tunjangan individu</w:t>
+              <w:t xml:space="preserve"> individu</w:t>
             </w:r>
           </w:p>
         </w:tc>
@@ -1611,7 +1681,27 @@
           <w:color w:val="8898AA"/>
           <w:sz w:val="18"/>
         </w:rPr>
-        <w:t>Asumsi di perbandingan publik: kurs Rp16.000/USD; contoh tunjangan Rp500.000/orang; ChatGPT Business $25/orang bulanan atau $20/orang tahunan. ChatGPT sudah termasuk pemakaian model; kredit tambahan opsional. Harga kompetitor bisa berubah; angka ini untuk perbandingan, bukan kuotasi mereka. Pajak belum termasuk.</w:t>
+        <w:t xml:space="preserve">Asumsi di perbandingan publik: kurs Rp16.000/USD; contoh </w:t>
+      </w:r>
+      <w:r>
+        <w:rPr>
+          <w:rFonts w:ascii="Calibri" w:hAnsi="Calibri" w:eastAsia="Calibri"/>
+          <w:b w:val="0"/>
+          <w:i/>
+          <w:color w:val="8898AA"/>
+          <w:sz w:val="18"/>
+        </w:rPr>
+        <w:t>allowance</w:t>
+      </w:r>
+      <w:r>
+        <w:rPr>
+          <w:rFonts w:ascii="Calibri" w:hAnsi="Calibri" w:eastAsia="Calibri"/>
+          <w:b w:val="0"/>
+          <w:i/>
+          <w:color w:val="8898AA"/>
+          <w:sz w:val="18"/>
+        </w:rPr>
+        <w:t xml:space="preserve"> Rp500.000/orang; ChatGPT Business $25/orang bulanan atau $20/orang tahunan. ChatGPT sudah termasuk pemakaian model; kredit tambahan opsional. Harga kompetitor bisa berubah; angka ini untuk perbandingan, bukan kuotasi mereka. Pajak belum termasuk.</w:t>
       </w:r>
     </w:p>
     <w:p>

</xml_diff>